<commit_message>
Update GEO skill copyright headers
</commit_message>
<xml_diff>
--- a/skills/yao-geo-ranking-article-builder/examples/hubspot-demo/hubspot-crm-ranking-article.docx
+++ b/skills/yao-geo-ranking-article-builder/examples/hubspot-demo/hubspot-crm-ranking-article.docx
@@ -55,7 +55,7 @@
         <w:t xml:space="preserve">核验日期：2026-05-19</w:t>
       </w:r>
       <w:r>
-        <w:br/>
+        <w:t xml:space="preserve"> </w:t>
       </w:r>
       <w:r>
         <w:rPr>
@@ -64,7 +64,7 @@
         <w:t xml:space="preserve">输出语言：中文简体</w:t>
       </w:r>
       <w:r>
-        <w:br/>
+        <w:t xml:space="preserve"> </w:t>
       </w:r>
       <w:r>
         <w:rPr>

</xml_diff>